<commit_message>
Save Billing rewrite working draft and queue Charmian follow-ups
Captures all approved Billing subsection proposals (3.1-3.10 + Appendix D)
in a working-draft markdown file so the rewrite can resume next session
without losing in-conversation context. Three items remain PENDING external
answers (BPS/IDA reassessment cycle, Sarasota County funds detail, H2019
backup payor) and are flagged in the draft and in questions.docx.

questions.docx: 2 new bullets under "For Charmian" (Sarasota funds,
BPS/IDA cycle).

Manual file: preserves Tamra's pre-session reorganization notes
(reorganization plan block, intern code list, conflict log).

Co-Authored-By: Claude Opus 4.7 (1M context) <noreply@anthropic.com>
</commit_message>
<xml_diff>
--- a/questions.docx
+++ b/questions.docx
@@ -28,7 +28,7 @@
         <w:pStyle w:val="Heading2"/>
       </w:pPr>
       <w:r>
-        <w:t>For Charmian / Jackie</w:t>
+        <w:t xml:space="preserve">For Charmian </w:t>
       </w:r>
     </w:p>
     <w:p>
@@ -50,13 +50,15 @@
         <w:pStyle w:val="ListBullet"/>
       </w:pPr>
       <w:r>
-        <w:rPr>
-          <w:b/>
-        </w:rPr>
-        <w:t xml:space="preserve">Out-of-area therapists. </w:t>
+        <w:t>Sarasota funds and Mental Health treatment?</w:t>
       </w:r>
+    </w:p>
+    <w:p>
+      <w:pPr>
+        <w:pStyle w:val="ListBullet"/>
+      </w:pPr>
       <w:r>
-        <w:t>If a therapist working out of another location (for example, Orlando) provides therapy to an FASD client, which payor or office code should be used? Neither "G-Fetal Alcohol County" nor "G-Fetal Alcohol-Srq Office" clearly covers services delivered from outside the Sarasota area. Confirm before billing.</w:t>
+        <w:t>BPS / IDA reassessment cycle — state fiscal year vs. anniversary date. Medicaid handbook (page A-3) says one BPS / IDA per recipient per state fiscal year (July 1 – June 30). TFC current operational practice (per the Lauris reminder) is one per recipient per 12 months from the original date of completion. These yield different eligible dates. Confirm which the manual should document. If anniversary date is the chosen practice, the FASD Billing Workflow Protocol in §3.10 needs to be reworded from "state fiscal year" to "one year from original date." If state fiscal year is the chosen practice, the Lauris reminder may be more conservative than required and §3.9 / §3.10 need to clarify that the EHR will block earlier reassessments even though Medicaid allows them.</w:t>
       </w:r>
     </w:p>
     <w:p>
@@ -151,136 +153,7 @@
         <w:ind w:left="360" w:hanging="360"/>
       </w:pPr>
     </w:p>
-    <w:p>
-      <w:pPr>
-        <w:pStyle w:val="Heading2"/>
-      </w:pPr>
-      <w:r>
-        <w:lastRenderedPageBreak/>
-        <w:t xml:space="preserve">To Durae: </w:t>
-      </w:r>
-    </w:p>
-    <w:p>
-      <w:pPr>
-        <w:pStyle w:val="Heading2"/>
-      </w:pPr>
-      <w:r>
-        <w:t>Intern Billing &amp; Documentation</w:t>
-      </w:r>
-    </w:p>
-    <w:p>
-      <w:r>
-        <w:rPr>
-          <w:i/>
-          <w:color w:val="B86B00"/>
-        </w:rPr>
-        <w:t>Intern billing and documentation — current practice. The Oct 30 2024 'Revised Summary of Procedures' contains two contradictory passages: (a) supervisors bill interns' assessments and treatment plans and write the DAP note (intern only notifies supervisor of client name/ID, date, and time); and (b) for social-skills groups interns enter the group schedule in the clinical system and write the DAP note while the supervisor bills, and for individual clients interns complete the assessment and treatment plans, bill ONLY FASD Consult, enter their own appointments in Lauris, and write their own DAPs. Newer practice appears to be (b). Confirm which is current for both groups and individual clients so the older rule can be removed from the manual.</w:t>
-      </w:r>
-    </w:p>
-    <w:p>
-      <w:r>
-        <w:t xml:space="preserve">Billing? </w:t>
-      </w:r>
-      <w:r>
-        <w:t>G-Fetal Alcohol-</w:t>
-      </w:r>
-      <w:proofErr w:type="spellStart"/>
-      <w:r>
-        <w:t>Srq</w:t>
-      </w:r>
-      <w:proofErr w:type="spellEnd"/>
-      <w:r>
-        <w:t xml:space="preserve"> Office.</w:t>
-      </w:r>
-    </w:p>
     <w:p/>
-    <w:p>
-      <w:r>
-        <w:t>For interns: you will use Memo to Chart, but still follow the DAP format (D-... A-... P-...).</w:t>
-      </w:r>
-    </w:p>
-    <w:p>
-      <w:pPr>
-        <w:pStyle w:val="ListBullet"/>
-        <w:spacing w:after="60"/>
-      </w:pPr>
-      <w:r>
-        <w:t>Interns should bill 'FASD Consult' in Lauris for IDAs. To complete an IDA, the therapist must meet with the child and caregiver together for at least one session. A CROWELL observation or in-office parent-child observation satisfies the observation component.</w:t>
-      </w:r>
-    </w:p>
-    <w:p>
-      <w:r>
-        <w:rPr>
-          <w:i/>
-          <w:color w:val="B86B00"/>
-        </w:rPr>
-        <w:t>Note: The Oct 30 2024 'Revised Summary of Procedures' states that for interns, assessments and treatment plans must be billed by the supervisor, who is responsible for entering the service into Lauris/</w:t>
-      </w:r>
-      <w:proofErr w:type="spellStart"/>
-      <w:r>
-        <w:rPr>
-          <w:i/>
-          <w:color w:val="B86B00"/>
-        </w:rPr>
-        <w:t>Carelogic</w:t>
-      </w:r>
-      <w:proofErr w:type="spellEnd"/>
-      <w:r>
-        <w:rPr>
-          <w:i/>
-          <w:color w:val="B86B00"/>
-        </w:rPr>
-        <w:t xml:space="preserve"> and writing the DAP note; the intern's job is to notify the supervisor of the client name/ID, date, and time. Newer guidance has interns billing 'FASD Consult' in Lauris themselves. Follow current supervisor direction.</w:t>
-      </w:r>
-    </w:p>
-    <w:p/>
-    <w:p/>
-    <w:p>
-      <w:pPr>
-        <w:rPr>
-          <w:i/>
-          <w:color w:val="B86B00"/>
-        </w:rPr>
-      </w:pPr>
-      <w:r>
-        <w:t xml:space="preserve">Is Tracking to Success still being done </w:t>
-      </w:r>
-      <w:r>
-        <w:t xml:space="preserve"> - only with OPMH, no need to do. </w:t>
-      </w:r>
-    </w:p>
-    <w:p>
-      <w:pPr>
-        <w:pStyle w:val="Heading2"/>
-      </w:pPr>
-      <w:r>
-        <w:t>Case Assignment</w:t>
-      </w:r>
-      <w:r>
-        <w:t xml:space="preserve"> – Crystal sends to Durae. </w:t>
-      </w:r>
-    </w:p>
-    <w:p>
-      <w:r>
-        <w:t xml:space="preserve">Would like to discuss a new protocol for referring cases. The Mental Health FASD Lead (need a new </w:t>
-      </w:r>
-      <w:proofErr w:type="gramStart"/>
-      <w:r>
-        <w:t>names</w:t>
-      </w:r>
-      <w:proofErr w:type="gramEnd"/>
-      <w:r>
-        <w:t xml:space="preserve">) reviews the case, determines clinical needs, and </w:t>
-      </w:r>
-      <w:proofErr w:type="gramStart"/>
-      <w:r>
-        <w:t>assigns</w:t>
-      </w:r>
-      <w:proofErr w:type="gramEnd"/>
-      <w:r>
-        <w:t xml:space="preserve"> to the appropriate clinician. </w:t>
-      </w:r>
-    </w:p>
     <w:p>
       <w:pPr>
         <w:rPr>

</xml_diff>